<commit_message>
Adding Finished ODS.pdf Sustainability Applied To The Production System - 2º DAW
</commit_message>
<xml_diff>
--- a/Sustainability Applied To The Production System - 2ºDAW/GarciaMartinez_JoseAngel_Accenture_ODS.docx
+++ b/Sustainability Applied To The Production System - 2ºDAW/GarciaMartinez_JoseAngel_Accenture_ODS.docx
@@ -10,6 +10,8 @@
           <w:rFonts w:ascii="Times New Roman" w:hAnsi="Times New Roman" w:cs="Times New Roman"/>
           <w:b/>
           <w:bCs/>
+          <w:sz w:val="20"/>
+          <w:szCs w:val="20"/>
         </w:rPr>
       </w:pPr>
       <w:r>
@@ -17,6 +19,8 @@
           <w:rFonts w:ascii="Times New Roman" w:hAnsi="Times New Roman" w:cs="Times New Roman"/>
           <w:b/>
           <w:bCs/>
+          <w:sz w:val="20"/>
+          <w:szCs w:val="20"/>
         </w:rPr>
         <w:t>Datos</w:t>
       </w:r>
@@ -27,12 +31,16 @@
         <w:jc w:val="both"/>
         <w:rPr>
           <w:rFonts w:ascii="Times New Roman" w:hAnsi="Times New Roman" w:cs="Times New Roman"/>
+          <w:sz w:val="20"/>
+          <w:szCs w:val="20"/>
         </w:rPr>
       </w:pPr>
       <w:proofErr w:type="spellStart"/>
       <w:r>
         <w:rPr>
           <w:rFonts w:ascii="Times New Roman" w:hAnsi="Times New Roman" w:cs="Times New Roman"/>
+          <w:sz w:val="20"/>
+          <w:szCs w:val="20"/>
         </w:rPr>
         <w:t>Alunmo</w:t>
       </w:r>
@@ -40,6 +48,8 @@
       <w:r>
         <w:rPr>
           <w:rFonts w:ascii="Times New Roman" w:hAnsi="Times New Roman" w:cs="Times New Roman"/>
+          <w:sz w:val="20"/>
+          <w:szCs w:val="20"/>
         </w:rPr>
         <w:t xml:space="preserve">/a: García </w:t>
       </w:r>
@@ -47,6 +57,8 @@
       <w:r>
         <w:rPr>
           <w:rFonts w:ascii="Times New Roman" w:hAnsi="Times New Roman" w:cs="Times New Roman"/>
+          <w:sz w:val="20"/>
+          <w:szCs w:val="20"/>
         </w:rPr>
         <w:t>Martínez,</w:t>
       </w:r>
@@ -54,6 +66,8 @@
       <w:r>
         <w:rPr>
           <w:rFonts w:ascii="Times New Roman" w:hAnsi="Times New Roman" w:cs="Times New Roman"/>
+          <w:sz w:val="20"/>
+          <w:szCs w:val="20"/>
         </w:rPr>
         <w:t xml:space="preserve"> José Ángel.</w:t>
       </w:r>
@@ -64,19 +78,25 @@
         <w:jc w:val="both"/>
         <w:rPr>
           <w:rFonts w:ascii="Times New Roman" w:hAnsi="Times New Roman" w:cs="Times New Roman"/>
+          <w:sz w:val="20"/>
+          <w:szCs w:val="20"/>
         </w:rPr>
       </w:pPr>
       <w:r>
         <w:rPr>
           <w:rFonts w:ascii="Times New Roman" w:hAnsi="Times New Roman" w:cs="Times New Roman"/>
+          <w:sz w:val="20"/>
+          <w:szCs w:val="20"/>
         </w:rPr>
         <w:t xml:space="preserve">Empresa: </w:t>
       </w:r>
-      <w:hyperlink r:id="rId5" w:history="1">
+      <w:hyperlink r:id="rId7" w:history="1">
         <w:r>
           <w:rPr>
             <w:rStyle w:val="Hipervnculo"/>
             <w:rFonts w:ascii="Times New Roman" w:hAnsi="Times New Roman" w:cs="Times New Roman"/>
+            <w:sz w:val="20"/>
+            <w:szCs w:val="20"/>
           </w:rPr>
           <w:t>Accenture</w:t>
         </w:r>
@@ -84,6 +104,8 @@
       <w:r>
         <w:rPr>
           <w:rFonts w:ascii="Times New Roman" w:hAnsi="Times New Roman" w:cs="Times New Roman"/>
+          <w:sz w:val="20"/>
+          <w:szCs w:val="20"/>
         </w:rPr>
         <w:t xml:space="preserve"> </w:t>
       </w:r>
@@ -94,11 +116,15 @@
         <w:jc w:val="both"/>
         <w:rPr>
           <w:rFonts w:ascii="Times New Roman" w:hAnsi="Times New Roman" w:cs="Times New Roman"/>
+          <w:sz w:val="20"/>
+          <w:szCs w:val="20"/>
         </w:rPr>
       </w:pPr>
       <w:r>
         <w:rPr>
           <w:rFonts w:ascii="Times New Roman" w:hAnsi="Times New Roman" w:cs="Times New Roman"/>
+          <w:sz w:val="20"/>
+          <w:szCs w:val="20"/>
         </w:rPr>
         <w:t>Sector y ámbito: Consultoría tecnológica y servicios digitales, actividad en España con presencia relevante en la Comunidad Valenciana.</w:t>
       </w:r>
@@ -109,11 +135,15 @@
         <w:jc w:val="both"/>
         <w:rPr>
           <w:rFonts w:ascii="Times New Roman" w:hAnsi="Times New Roman" w:cs="Times New Roman"/>
+          <w:sz w:val="20"/>
+          <w:szCs w:val="20"/>
         </w:rPr>
       </w:pPr>
       <w:r>
         <w:rPr>
           <w:rFonts w:ascii="Times New Roman" w:hAnsi="Times New Roman" w:cs="Times New Roman"/>
+          <w:sz w:val="20"/>
+          <w:szCs w:val="20"/>
         </w:rPr>
         <w:t>Foco temático seleccionado: Talento, empleo de calidad y sostenibilidad corporativa.</w:t>
       </w:r>
@@ -126,6 +156,8 @@
           <w:rFonts w:ascii="Times New Roman" w:hAnsi="Times New Roman" w:cs="Times New Roman"/>
           <w:b/>
           <w:bCs/>
+          <w:sz w:val="20"/>
+          <w:szCs w:val="20"/>
         </w:rPr>
       </w:pPr>
       <w:r>
@@ -133,6 +165,8 @@
           <w:rFonts w:ascii="Times New Roman" w:hAnsi="Times New Roman" w:cs="Times New Roman"/>
           <w:b/>
           <w:bCs/>
+          <w:sz w:val="20"/>
+          <w:szCs w:val="20"/>
         </w:rPr>
         <w:t>Evidencias</w:t>
       </w:r>
@@ -140,18 +174,28 @@
     <w:tbl>
       <w:tblPr>
         <w:tblStyle w:val="Tablaconcuadrcula"/>
-        <w:tblW w:w="0" w:type="auto"/>
+        <w:tblW w:w="8494" w:type="dxa"/>
+        <w:tblInd w:w="-10" w:type="dxa"/>
         <w:tblLook w:val="04A0" w:firstRow="1" w:lastRow="0" w:firstColumn="1" w:lastColumn="0" w:noHBand="0" w:noVBand="1"/>
       </w:tblPr>
       <w:tblGrid>
-        <w:gridCol w:w="1271"/>
+        <w:gridCol w:w="10"/>
+        <w:gridCol w:w="1261"/>
+        <w:gridCol w:w="10"/>
         <w:gridCol w:w="7203"/>
+        <w:gridCol w:w="10"/>
       </w:tblGrid>
       <w:tr>
+        <w:trPr>
+          <w:gridBefore w:val="1"/>
+          <w:gridAfter w:val="1"/>
+          <w:wBefore w:w="10" w:type="dxa"/>
+          <w:wAfter w:w="10" w:type="dxa"/>
+        </w:trPr>
         <w:tc>
           <w:tcPr>
-            <w:tcW w:w="8494" w:type="dxa"/>
-            <w:gridSpan w:val="2"/>
+            <w:tcW w:w="8474" w:type="dxa"/>
+            <w:gridSpan w:val="3"/>
             <w:tcBorders>
               <w:top w:val="single" w:sz="12" w:space="0" w:color="E97132" w:themeColor="accent2"/>
               <w:left w:val="single" w:sz="12" w:space="0" w:color="E97132" w:themeColor="accent2"/>
@@ -198,10 +242,16 @@
         </w:tc>
       </w:tr>
       <w:tr>
+        <w:trPr>
+          <w:gridBefore w:val="1"/>
+          <w:gridAfter w:val="1"/>
+          <w:wBefore w:w="10" w:type="dxa"/>
+          <w:wAfter w:w="10" w:type="dxa"/>
+        </w:trPr>
         <w:tc>
           <w:tcPr>
-            <w:tcW w:w="8494" w:type="dxa"/>
-            <w:gridSpan w:val="2"/>
+            <w:tcW w:w="8474" w:type="dxa"/>
+            <w:gridSpan w:val="3"/>
             <w:tcBorders>
               <w:top w:val="single" w:sz="12" w:space="0" w:color="E97132" w:themeColor="accent2"/>
               <w:left w:val="single" w:sz="12" w:space="0" w:color="E97132" w:themeColor="accent2"/>
@@ -240,10 +290,16 @@
         </w:tc>
       </w:tr>
       <w:tr>
+        <w:trPr>
+          <w:gridBefore w:val="1"/>
+          <w:gridAfter w:val="1"/>
+          <w:wBefore w:w="10" w:type="dxa"/>
+          <w:wAfter w:w="10" w:type="dxa"/>
+        </w:trPr>
         <w:tc>
           <w:tcPr>
-            <w:tcW w:w="8494" w:type="dxa"/>
-            <w:gridSpan w:val="2"/>
+            <w:tcW w:w="8474" w:type="dxa"/>
+            <w:gridSpan w:val="3"/>
             <w:tcBorders>
               <w:top w:val="single" w:sz="12" w:space="0" w:color="E97132" w:themeColor="accent2"/>
               <w:left w:val="single" w:sz="12" w:space="0" w:color="E97132" w:themeColor="accent2"/>
@@ -273,7 +329,7 @@
               </w:rPr>
               <w:t xml:space="preserve">Enlace: </w:t>
             </w:r>
-            <w:hyperlink r:id="rId6" w:history="1">
+            <w:hyperlink r:id="rId8" w:history="1">
               <w:r>
                 <w:rPr>
                   <w:rStyle w:val="Hipervnculo"/>
@@ -320,9 +376,65 @@
         </w:tc>
       </w:tr>
       <w:tr>
+        <w:trPr>
+          <w:gridBefore w:val="1"/>
+          <w:gridAfter w:val="1"/>
+          <w:wBefore w:w="10" w:type="dxa"/>
+          <w:wAfter w:w="10" w:type="dxa"/>
+        </w:trPr>
         <w:tc>
           <w:tcPr>
-            <w:tcW w:w="8494" w:type="dxa"/>
+            <w:tcW w:w="8474" w:type="dxa"/>
+            <w:gridSpan w:val="3"/>
+            <w:tcBorders>
+              <w:top w:val="single" w:sz="12" w:space="0" w:color="E97132" w:themeColor="accent2"/>
+              <w:left w:val="single" w:sz="12" w:space="0" w:color="E97132" w:themeColor="accent2"/>
+              <w:bottom w:val="single" w:sz="12" w:space="0" w:color="E97132" w:themeColor="accent2"/>
+              <w:right w:val="single" w:sz="12" w:space="0" w:color="E97132" w:themeColor="accent2"/>
+            </w:tcBorders>
+          </w:tcPr>
+          <w:p>
+            <w:pPr>
+              <w:jc w:val="both"/>
+              <w:rPr>
+                <w:rFonts w:ascii="Times New Roman" w:hAnsi="Times New Roman" w:cs="Times New Roman"/>
+                <w:b/>
+                <w:bCs/>
+                <w:sz w:val="20"/>
+                <w:szCs w:val="20"/>
+              </w:rPr>
+            </w:pPr>
+            <w:r>
+              <w:rPr>
+                <w:rFonts w:ascii="Times New Roman" w:hAnsi="Times New Roman" w:cs="Times New Roman"/>
+                <w:b/>
+                <w:bCs/>
+                <w:sz w:val="20"/>
+                <w:szCs w:val="20"/>
+              </w:rPr>
+              <w:t xml:space="preserve">ODS relacionados: </w:t>
+            </w:r>
+            <w:r>
+              <w:rPr>
+                <w:rFonts w:ascii="Times New Roman" w:hAnsi="Times New Roman" w:cs="Times New Roman"/>
+                <w:sz w:val="20"/>
+                <w:szCs w:val="20"/>
+              </w:rPr>
+              <w:t>ODS 4, ODS 8, ODS 9.</w:t>
+            </w:r>
+          </w:p>
+        </w:tc>
+      </w:tr>
+      <w:tr>
+        <w:trPr>
+          <w:gridBefore w:val="1"/>
+          <w:gridAfter w:val="1"/>
+          <w:wBefore w:w="10" w:type="dxa"/>
+          <w:wAfter w:w="10" w:type="dxa"/>
+        </w:trPr>
+        <w:tc>
+          <w:tcPr>
+            <w:tcW w:w="1271" w:type="dxa"/>
             <w:gridSpan w:val="2"/>
             <w:tcBorders>
               <w:top w:val="single" w:sz="12" w:space="0" w:color="E97132" w:themeColor="accent2"/>
@@ -342,31 +454,53 @@
                 <w:szCs w:val="20"/>
               </w:rPr>
             </w:pPr>
-            <w:r>
-              <w:rPr>
-                <w:rFonts w:ascii="Times New Roman" w:hAnsi="Times New Roman" w:cs="Times New Roman"/>
-                <w:b/>
-                <w:bCs/>
-                <w:sz w:val="20"/>
-                <w:szCs w:val="20"/>
-              </w:rPr>
-              <w:t xml:space="preserve">ODS relacionados: </w:t>
-            </w:r>
-            <w:r>
-              <w:rPr>
-                <w:rFonts w:ascii="Times New Roman" w:hAnsi="Times New Roman" w:cs="Times New Roman"/>
-                <w:sz w:val="20"/>
-                <w:szCs w:val="20"/>
-              </w:rPr>
-              <w:t>ODS 4, ODS 8, ODS 9.</w:t>
+          </w:p>
+          <w:p>
+            <w:pPr>
+              <w:jc w:val="both"/>
+              <w:rPr>
+                <w:rFonts w:ascii="Times New Roman" w:hAnsi="Times New Roman" w:cs="Times New Roman"/>
+                <w:b/>
+                <w:bCs/>
+                <w:sz w:val="20"/>
+                <w:szCs w:val="20"/>
+              </w:rPr>
+            </w:pPr>
+            <w:r>
+              <w:rPr>
+                <w:rFonts w:ascii="Times New Roman" w:hAnsi="Times New Roman" w:cs="Times New Roman"/>
+                <w:b/>
+                <w:bCs/>
+                <w:sz w:val="20"/>
+                <w:szCs w:val="20"/>
+              </w:rPr>
+              <w:t>Meta ODS</w:t>
+            </w:r>
+          </w:p>
+          <w:p>
+            <w:pPr>
+              <w:jc w:val="both"/>
+              <w:rPr>
+                <w:rFonts w:ascii="Times New Roman" w:hAnsi="Times New Roman" w:cs="Times New Roman"/>
+                <w:sz w:val="20"/>
+                <w:szCs w:val="20"/>
+              </w:rPr>
+            </w:pPr>
+            <w:r>
+              <w:rPr>
+                <w:rFonts w:ascii="Times New Roman" w:hAnsi="Times New Roman" w:cs="Times New Roman"/>
+                <w:b/>
+                <w:bCs/>
+                <w:sz w:val="20"/>
+                <w:szCs w:val="20"/>
+              </w:rPr>
+              <w:t xml:space="preserve"> </w:t>
             </w:r>
           </w:p>
         </w:tc>
-      </w:tr>
-      <w:tr>
         <w:tc>
           <w:tcPr>
-            <w:tcW w:w="1271" w:type="dxa"/>
+            <w:tcW w:w="7203" w:type="dxa"/>
             <w:tcBorders>
               <w:top w:val="single" w:sz="12" w:space="0" w:color="E97132" w:themeColor="accent2"/>
               <w:left w:val="single" w:sz="12" w:space="0" w:color="E97132" w:themeColor="accent2"/>
@@ -379,20 +513,24 @@
               <w:jc w:val="both"/>
               <w:rPr>
                 <w:rFonts w:ascii="Times New Roman" w:hAnsi="Times New Roman" w:cs="Times New Roman"/>
-                <w:b/>
-                <w:bCs/>
                 <w:sz w:val="20"/>
                 <w:szCs w:val="20"/>
               </w:rPr>
             </w:pPr>
+            <w:r>
+              <w:rPr>
+                <w:rFonts w:ascii="Times New Roman" w:hAnsi="Times New Roman" w:cs="Times New Roman"/>
+                <w:sz w:val="20"/>
+                <w:szCs w:val="20"/>
+              </w:rPr>
+              <w:t>4.4: Competencias técnicas y profesionales.</w:t>
+            </w:r>
           </w:p>
           <w:p>
             <w:pPr>
               <w:jc w:val="both"/>
               <w:rPr>
                 <w:rFonts w:ascii="Times New Roman" w:hAnsi="Times New Roman" w:cs="Times New Roman"/>
-                <w:b/>
-                <w:bCs/>
                 <w:sz w:val="20"/>
                 <w:szCs w:val="20"/>
               </w:rPr>
@@ -400,12 +538,10 @@
             <w:r>
               <w:rPr>
                 <w:rFonts w:ascii="Times New Roman" w:hAnsi="Times New Roman" w:cs="Times New Roman"/>
-                <w:b/>
-                <w:bCs/>
-                <w:sz w:val="20"/>
-                <w:szCs w:val="20"/>
-              </w:rPr>
-              <w:t>Meta ODS:</w:t>
+                <w:sz w:val="20"/>
+                <w:szCs w:val="20"/>
+              </w:rPr>
+              <w:t>8.5: Empleo pleno y productivo y trabajo decente.</w:t>
             </w:r>
           </w:p>
           <w:p>
@@ -420,18 +556,82 @@
             <w:r>
               <w:rPr>
                 <w:rFonts w:ascii="Times New Roman" w:hAnsi="Times New Roman" w:cs="Times New Roman"/>
-                <w:b/>
-                <w:bCs/>
-                <w:sz w:val="20"/>
-                <w:szCs w:val="20"/>
-              </w:rPr>
-              <w:t xml:space="preserve"> </w:t>
+                <w:sz w:val="20"/>
+                <w:szCs w:val="20"/>
+              </w:rPr>
+              <w:t xml:space="preserve">9.5: Capacidad tecnológica e innovación.  </w:t>
             </w:r>
           </w:p>
         </w:tc>
+      </w:tr>
+      <w:tr>
+        <w:trPr>
+          <w:gridBefore w:val="1"/>
+          <w:gridAfter w:val="1"/>
+          <w:wBefore w:w="10" w:type="dxa"/>
+          <w:wAfter w:w="10" w:type="dxa"/>
+        </w:trPr>
         <w:tc>
           <w:tcPr>
-            <w:tcW w:w="7223" w:type="dxa"/>
+            <w:tcW w:w="8474" w:type="dxa"/>
+            <w:gridSpan w:val="3"/>
+            <w:tcBorders>
+              <w:left w:val="single" w:sz="12" w:space="0" w:color="E97132" w:themeColor="accent2"/>
+              <w:bottom w:val="single" w:sz="12" w:space="0" w:color="E97132" w:themeColor="accent2"/>
+              <w:right w:val="single" w:sz="12" w:space="0" w:color="E97132" w:themeColor="accent2"/>
+            </w:tcBorders>
+          </w:tcPr>
+          <w:p>
+            <w:pPr>
+              <w:jc w:val="both"/>
+              <w:rPr>
+                <w:rFonts w:ascii="Times New Roman" w:hAnsi="Times New Roman" w:cs="Times New Roman"/>
+                <w:sz w:val="20"/>
+                <w:szCs w:val="20"/>
+              </w:rPr>
+            </w:pPr>
+            <w:r>
+              <w:rPr>
+                <w:rFonts w:ascii="Times New Roman" w:hAnsi="Times New Roman" w:cs="Times New Roman"/>
+                <w:b/>
+                <w:bCs/>
+                <w:sz w:val="20"/>
+                <w:szCs w:val="20"/>
+              </w:rPr>
+              <w:t>Alineación jurídica:</w:t>
+            </w:r>
+            <w:r>
+              <w:rPr>
+                <w:rFonts w:ascii="Times New Roman" w:hAnsi="Times New Roman" w:cs="Times New Roman"/>
+                <w:b/>
+                <w:bCs/>
+                <w:sz w:val="20"/>
+                <w:szCs w:val="20"/>
+              </w:rPr>
+              <w:t xml:space="preserve"> </w:t>
+            </w:r>
+            <w:r>
+              <w:rPr>
+                <w:rFonts w:ascii="Times New Roman" w:hAnsi="Times New Roman" w:cs="Times New Roman"/>
+                <w:sz w:val="20"/>
+                <w:szCs w:val="20"/>
+              </w:rPr>
+              <w:t>EINF / CSRD | Relación indirecta con el Pacto Verde Europeo por la integración de sostenibilidad y gobernanza empresarial.</w:t>
+            </w:r>
+          </w:p>
+        </w:tc>
+      </w:tr>
+      <w:tr>
+        <w:trPr>
+          <w:gridBefore w:val="1"/>
+          <w:gridAfter w:val="1"/>
+          <w:wBefore w:w="10" w:type="dxa"/>
+          <w:wAfter w:w="10" w:type="dxa"/>
+        </w:trPr>
+        <w:tc>
+          <w:tcPr>
+            <w:tcW w:w="8474" w:type="dxa"/>
+            <w:gridSpan w:val="3"/>
             <w:tcBorders>
               <w:top w:val="single" w:sz="12" w:space="0" w:color="E97132" w:themeColor="accent2"/>
               <w:left w:val="single" w:sz="12" w:space="0" w:color="E97132" w:themeColor="accent2"/>
@@ -454,119 +654,18 @@
                 <w:sz w:val="20"/>
                 <w:szCs w:val="20"/>
               </w:rPr>
-              <w:t>4.4: Competencias técnicas y profesionales.</w:t>
-            </w:r>
-          </w:p>
-          <w:p>
-            <w:pPr>
-              <w:jc w:val="both"/>
-              <w:rPr>
-                <w:rFonts w:ascii="Times New Roman" w:hAnsi="Times New Roman" w:cs="Times New Roman"/>
-                <w:sz w:val="20"/>
-                <w:szCs w:val="20"/>
-              </w:rPr>
-            </w:pPr>
-            <w:r>
-              <w:rPr>
-                <w:rFonts w:ascii="Times New Roman" w:hAnsi="Times New Roman" w:cs="Times New Roman"/>
-                <w:sz w:val="20"/>
-                <w:szCs w:val="20"/>
-              </w:rPr>
-              <w:t>8.5: Empleo pleno y productivo y trabajo decente.</w:t>
-            </w:r>
-          </w:p>
-          <w:p>
-            <w:pPr>
-              <w:jc w:val="both"/>
-              <w:rPr>
-                <w:rFonts w:ascii="Times New Roman" w:hAnsi="Times New Roman" w:cs="Times New Roman"/>
-                <w:sz w:val="20"/>
-                <w:szCs w:val="20"/>
-              </w:rPr>
-            </w:pPr>
-            <w:r>
-              <w:rPr>
-                <w:rFonts w:ascii="Times New Roman" w:hAnsi="Times New Roman" w:cs="Times New Roman"/>
-                <w:sz w:val="20"/>
-                <w:szCs w:val="20"/>
-              </w:rPr>
-              <w:t xml:space="preserve">9.5: Capacidad tecnológica e innovación.  </w:t>
-            </w:r>
-          </w:p>
-        </w:tc>
-      </w:tr>
-      <w:tr>
-        <w:tc>
-          <w:tcPr>
-            <w:tcW w:w="8494" w:type="dxa"/>
-            <w:gridSpan w:val="2"/>
-            <w:tcBorders>
-              <w:left w:val="single" w:sz="12" w:space="0" w:color="E97132" w:themeColor="accent2"/>
-              <w:bottom w:val="single" w:sz="12" w:space="0" w:color="E97132" w:themeColor="accent2"/>
-              <w:right w:val="single" w:sz="12" w:space="0" w:color="E97132" w:themeColor="accent2"/>
-            </w:tcBorders>
-          </w:tcPr>
-          <w:p>
-            <w:pPr>
-              <w:jc w:val="both"/>
-              <w:rPr>
-                <w:rFonts w:ascii="Times New Roman" w:hAnsi="Times New Roman" w:cs="Times New Roman"/>
-                <w:sz w:val="20"/>
-                <w:szCs w:val="20"/>
-              </w:rPr>
-            </w:pPr>
-            <w:r>
-              <w:rPr>
-                <w:rFonts w:ascii="Times New Roman" w:hAnsi="Times New Roman" w:cs="Times New Roman"/>
-                <w:b/>
-                <w:bCs/>
-                <w:sz w:val="20"/>
-                <w:szCs w:val="20"/>
-              </w:rPr>
-              <w:t>Alineación jurídica:</w:t>
-            </w:r>
-            <w:r>
-              <w:rPr>
-                <w:rFonts w:ascii="Times New Roman" w:hAnsi="Times New Roman" w:cs="Times New Roman"/>
-                <w:b/>
-                <w:bCs/>
-                <w:sz w:val="20"/>
-                <w:szCs w:val="20"/>
-              </w:rPr>
               <w:t xml:space="preserve"> </w:t>
             </w:r>
             <w:r>
               <w:rPr>
                 <w:rFonts w:ascii="Times New Roman" w:hAnsi="Times New Roman" w:cs="Times New Roman"/>
-                <w:sz w:val="20"/>
-                <w:szCs w:val="20"/>
-              </w:rPr>
-              <w:t>EINF / CSRD | Relación indirecta con el Pacto Verde Europeo por la integración de sostenibilidad y gobernanza empresarial.</w:t>
-            </w:r>
-          </w:p>
-        </w:tc>
-      </w:tr>
-      <w:tr>
-        <w:tc>
-          <w:tcPr>
-            <w:tcW w:w="8494" w:type="dxa"/>
-            <w:gridSpan w:val="2"/>
-            <w:tcBorders>
-              <w:top w:val="single" w:sz="12" w:space="0" w:color="E97132" w:themeColor="accent2"/>
-              <w:left w:val="single" w:sz="12" w:space="0" w:color="E97132" w:themeColor="accent2"/>
-              <w:bottom w:val="single" w:sz="12" w:space="0" w:color="E97132" w:themeColor="accent2"/>
-              <w:right w:val="single" w:sz="12" w:space="0" w:color="E97132" w:themeColor="accent2"/>
-            </w:tcBorders>
-          </w:tcPr>
-          <w:p>
-            <w:pPr>
-              <w:jc w:val="both"/>
-              <w:rPr>
-                <w:rFonts w:ascii="Times New Roman" w:hAnsi="Times New Roman" w:cs="Times New Roman"/>
-                <w:sz w:val="20"/>
-                <w:szCs w:val="20"/>
-              </w:rPr>
-            </w:pPr>
+                <w:b/>
+                <w:bCs/>
+                <w:sz w:val="20"/>
+                <w:szCs w:val="20"/>
+              </w:rPr>
+              <w:t>Indicador/KPI citado:</w:t>
+            </w:r>
             <w:r>
               <w:rPr>
                 <w:rFonts w:ascii="Times New Roman" w:hAnsi="Times New Roman" w:cs="Times New Roman"/>
@@ -578,30 +677,12 @@
             <w:r>
               <w:rPr>
                 <w:rFonts w:ascii="Times New Roman" w:hAnsi="Times New Roman" w:cs="Times New Roman"/>
-                <w:b/>
-                <w:bCs/>
-                <w:sz w:val="20"/>
-                <w:szCs w:val="20"/>
-              </w:rPr>
-              <w:t>Indicador/KPI citado:</w:t>
-            </w:r>
-            <w:r>
-              <w:rPr>
-                <w:rFonts w:ascii="Times New Roman" w:hAnsi="Times New Roman" w:cs="Times New Roman"/>
-                <w:sz w:val="20"/>
-                <w:szCs w:val="20"/>
-              </w:rPr>
-              <w:t xml:space="preserve"> </w:t>
-            </w:r>
-            <w:r>
-              <w:rPr>
-                <w:rFonts w:ascii="Times New Roman" w:hAnsi="Times New Roman" w:cs="Times New Roman"/>
                 <w:sz w:val="20"/>
                 <w:szCs w:val="20"/>
               </w:rPr>
               <w:t xml:space="preserve">Dependerá del apartado que cites dentro del </w:t>
             </w:r>
-            <w:hyperlink r:id="rId7" w:anchor="zoom=40" w:history="1">
+            <w:hyperlink r:id="rId9" w:anchor="zoom=40" w:history="1">
               <w:r>
                 <w:rPr>
                   <w:rStyle w:val="Hipervnculo"/>
@@ -727,38 +808,16 @@
           </w:p>
         </w:tc>
       </w:tr>
-    </w:tbl>
-    <w:p>
-      <w:pPr>
-        <w:spacing w:line="240" w:lineRule="auto"/>
-        <w:jc w:val="both"/>
-        <w:rPr>
-          <w:rFonts w:ascii="Times New Roman" w:hAnsi="Times New Roman" w:cs="Times New Roman"/>
-          <w:b/>
-          <w:bCs/>
-          <w:sz w:val="8"/>
-          <w:szCs w:val="8"/>
-        </w:rPr>
-      </w:pPr>
-    </w:p>
-    <w:tbl>
-      <w:tblPr>
-        <w:tblStyle w:val="Tablaconcuadrcula"/>
-        <w:tblW w:w="8483" w:type="dxa"/>
-        <w:tblLook w:val="04A0" w:firstRow="1" w:lastRow="0" w:firstColumn="1" w:lastColumn="0" w:noHBand="0" w:noVBand="1"/>
-      </w:tblPr>
-      <w:tblGrid>
-        <w:gridCol w:w="1261"/>
-        <w:gridCol w:w="7222"/>
-      </w:tblGrid>
       <w:tr>
         <w:trPr>
+          <w:gridBefore w:val="1"/>
+          <w:wBefore w:w="10" w:type="dxa"/>
           <w:trHeight w:val="272"/>
         </w:trPr>
         <w:tc>
           <w:tcPr>
-            <w:tcW w:w="8483" w:type="dxa"/>
-            <w:gridSpan w:val="2"/>
+            <w:tcW w:w="8484" w:type="dxa"/>
+            <w:gridSpan w:val="4"/>
             <w:tcBorders>
               <w:top w:val="single" w:sz="12" w:space="0" w:color="A02B93" w:themeColor="accent5"/>
               <w:left w:val="single" w:sz="12" w:space="0" w:color="A02B93" w:themeColor="accent5"/>
@@ -786,7 +845,7 @@
               </w:rPr>
               <w:t xml:space="preserve">Titular: </w:t>
             </w:r>
-            <w:hyperlink r:id="rId8" w:history="1">
+            <w:hyperlink r:id="rId10" w:history="1">
               <w:r>
                 <w:rPr>
                   <w:rStyle w:val="Hipervnculo"/>
@@ -810,12 +869,14 @@
       </w:tr>
       <w:tr>
         <w:trPr>
+          <w:gridBefore w:val="1"/>
+          <w:wBefore w:w="10" w:type="dxa"/>
           <w:trHeight w:val="262"/>
         </w:trPr>
         <w:tc>
           <w:tcPr>
-            <w:tcW w:w="8483" w:type="dxa"/>
-            <w:gridSpan w:val="2"/>
+            <w:tcW w:w="8484" w:type="dxa"/>
+            <w:gridSpan w:val="4"/>
             <w:tcBorders>
               <w:top w:val="single" w:sz="12" w:space="0" w:color="A02B93" w:themeColor="accent5"/>
               <w:left w:val="single" w:sz="12" w:space="0" w:color="A02B93" w:themeColor="accent5"/>
@@ -866,12 +927,14 @@
       </w:tr>
       <w:tr>
         <w:trPr>
+          <w:gridBefore w:val="1"/>
+          <w:wBefore w:w="10" w:type="dxa"/>
           <w:trHeight w:val="272"/>
         </w:trPr>
         <w:tc>
           <w:tcPr>
-            <w:tcW w:w="8483" w:type="dxa"/>
-            <w:gridSpan w:val="2"/>
+            <w:tcW w:w="8484" w:type="dxa"/>
+            <w:gridSpan w:val="4"/>
             <w:tcBorders>
               <w:top w:val="single" w:sz="12" w:space="0" w:color="A02B93" w:themeColor="accent5"/>
               <w:left w:val="single" w:sz="12" w:space="0" w:color="A02B93" w:themeColor="accent5"/>
@@ -910,7 +973,7 @@
               </w:rPr>
               <w:t xml:space="preserve"> </w:t>
             </w:r>
-            <w:hyperlink r:id="rId9" w:history="1">
+            <w:hyperlink r:id="rId11" w:history="1">
               <w:r>
                 <w:rPr>
                   <w:rStyle w:val="Hipervnculo"/>
@@ -919,7 +982,27 @@
                   <w:szCs w:val="20"/>
                   <w:lang w:val="en-GB"/>
                 </w:rPr>
-                <w:t>https://www.accenture.com/es-es/services/sustainability/sustainability-measurement</w:t>
+                <w:t>https://www.accenture.com/es-es/services/sust</w:t>
+              </w:r>
+              <w:r>
+                <w:rPr>
+                  <w:rStyle w:val="Hipervnculo"/>
+                  <w:rFonts w:ascii="Times New Roman" w:hAnsi="Times New Roman" w:cs="Times New Roman"/>
+                  <w:sz w:val="20"/>
+                  <w:szCs w:val="20"/>
+                  <w:lang w:val="en-GB"/>
+                </w:rPr>
+                <w:t>a</w:t>
+              </w:r>
+              <w:r>
+                <w:rPr>
+                  <w:rStyle w:val="Hipervnculo"/>
+                  <w:rFonts w:ascii="Times New Roman" w:hAnsi="Times New Roman" w:cs="Times New Roman"/>
+                  <w:sz w:val="20"/>
+                  <w:szCs w:val="20"/>
+                  <w:lang w:val="en-GB"/>
+                </w:rPr>
+                <w:t>inability/sustainability-measurement</w:t>
               </w:r>
             </w:hyperlink>
             <w:r>
@@ -936,12 +1019,14 @@
       </w:tr>
       <w:tr>
         <w:trPr>
+          <w:gridBefore w:val="1"/>
+          <w:wBefore w:w="10" w:type="dxa"/>
           <w:trHeight w:val="262"/>
         </w:trPr>
         <w:tc>
           <w:tcPr>
-            <w:tcW w:w="8483" w:type="dxa"/>
-            <w:gridSpan w:val="2"/>
+            <w:tcW w:w="8484" w:type="dxa"/>
+            <w:gridSpan w:val="4"/>
             <w:tcBorders>
               <w:top w:val="single" w:sz="12" w:space="0" w:color="A02B93" w:themeColor="accent5"/>
               <w:left w:val="single" w:sz="12" w:space="0" w:color="A02B93" w:themeColor="accent5"/>
@@ -1024,6 +1109,8 @@
       </w:tr>
       <w:tr>
         <w:trPr>
+          <w:gridBefore w:val="1"/>
+          <w:wBefore w:w="10" w:type="dxa"/>
           <w:trHeight w:val="272"/>
         </w:trPr>
         <w:tc>
@@ -1054,13 +1141,14 @@
                 <w:sz w:val="20"/>
                 <w:szCs w:val="20"/>
               </w:rPr>
-              <w:t>Meta ODS:</w:t>
+              <w:t>Meta ODS</w:t>
             </w:r>
           </w:p>
         </w:tc>
         <w:tc>
           <w:tcPr>
-            <w:tcW w:w="7222" w:type="dxa"/>
+            <w:tcW w:w="7223" w:type="dxa"/>
+            <w:gridSpan w:val="3"/>
             <w:tcBorders>
               <w:top w:val="single" w:sz="12" w:space="0" w:color="A02B93" w:themeColor="accent5"/>
               <w:left w:val="single" w:sz="12" w:space="0" w:color="A02B93" w:themeColor="accent5"/>
@@ -1106,12 +1194,14 @@
       </w:tr>
       <w:tr>
         <w:trPr>
+          <w:gridBefore w:val="1"/>
+          <w:wBefore w:w="10" w:type="dxa"/>
           <w:trHeight w:val="272"/>
         </w:trPr>
         <w:tc>
           <w:tcPr>
-            <w:tcW w:w="8483" w:type="dxa"/>
-            <w:gridSpan w:val="2"/>
+            <w:tcW w:w="8484" w:type="dxa"/>
+            <w:gridSpan w:val="4"/>
             <w:tcBorders>
               <w:top w:val="single" w:sz="12" w:space="0" w:color="A02B93" w:themeColor="accent5"/>
               <w:left w:val="single" w:sz="12" w:space="0" w:color="A02B93" w:themeColor="accent5"/>
@@ -1139,17 +1229,37 @@
               </w:rPr>
               <w:t>Alineación jurídica:</w:t>
             </w:r>
+            <w:r>
+              <w:rPr>
+                <w:rFonts w:ascii="Times New Roman" w:hAnsi="Times New Roman" w:cs="Times New Roman"/>
+                <w:b/>
+                <w:bCs/>
+                <w:sz w:val="20"/>
+                <w:szCs w:val="20"/>
+              </w:rPr>
+              <w:t xml:space="preserve"> </w:t>
+            </w:r>
+            <w:r>
+              <w:rPr>
+                <w:rFonts w:ascii="Times New Roman" w:hAnsi="Times New Roman" w:cs="Times New Roman"/>
+                <w:sz w:val="20"/>
+                <w:szCs w:val="20"/>
+              </w:rPr>
+              <w:t>CSRD / EINF | Relación con el Pacto Verde Europeo por la integración de sostenibilidad y gobernanza empresarial.</w:t>
+            </w:r>
           </w:p>
         </w:tc>
       </w:tr>
       <w:tr>
         <w:trPr>
+          <w:gridBefore w:val="1"/>
+          <w:wBefore w:w="10" w:type="dxa"/>
           <w:trHeight w:val="262"/>
         </w:trPr>
         <w:tc>
           <w:tcPr>
-            <w:tcW w:w="8483" w:type="dxa"/>
-            <w:gridSpan w:val="2"/>
+            <w:tcW w:w="8484" w:type="dxa"/>
+            <w:gridSpan w:val="4"/>
             <w:tcBorders>
               <w:top w:val="single" w:sz="12" w:space="0" w:color="A02B93" w:themeColor="accent5"/>
               <w:left w:val="single" w:sz="12" w:space="0" w:color="A02B93" w:themeColor="accent5"/>
@@ -1161,8 +1271,6 @@
             <w:pPr>
               <w:rPr>
                 <w:rFonts w:ascii="Times New Roman" w:hAnsi="Times New Roman" w:cs="Times New Roman"/>
-                <w:b/>
-                <w:bCs/>
                 <w:sz w:val="20"/>
                 <w:szCs w:val="20"/>
               </w:rPr>
@@ -1176,6 +1284,466 @@
                 <w:szCs w:val="20"/>
               </w:rPr>
               <w:t>Indicador/KPI citado:</w:t>
+            </w:r>
+            <w:r>
+              <w:rPr>
+                <w:rFonts w:ascii="Times New Roman" w:hAnsi="Times New Roman" w:cs="Times New Roman"/>
+                <w:b/>
+                <w:bCs/>
+                <w:sz w:val="20"/>
+                <w:szCs w:val="20"/>
+              </w:rPr>
+              <w:t xml:space="preserve"> </w:t>
+            </w:r>
+            <w:r>
+              <w:rPr>
+                <w:rFonts w:ascii="Times New Roman" w:hAnsi="Times New Roman" w:cs="Times New Roman"/>
+                <w:sz w:val="20"/>
+                <w:szCs w:val="20"/>
+              </w:rPr>
+              <w:t>herramientas de IA generativas aplicadas al reporte de ESG y al cumplimiento CSRD.</w:t>
+            </w:r>
+          </w:p>
+        </w:tc>
+      </w:tr>
+      <w:tr>
+        <w:tc>
+          <w:tcPr>
+            <w:tcW w:w="8494" w:type="dxa"/>
+            <w:gridSpan w:val="5"/>
+            <w:tcBorders>
+              <w:left w:val="single" w:sz="12" w:space="0" w:color="0F9ED5" w:themeColor="accent4"/>
+              <w:bottom w:val="single" w:sz="12" w:space="0" w:color="0F9ED5" w:themeColor="accent4"/>
+              <w:right w:val="single" w:sz="12" w:space="0" w:color="0F9ED5" w:themeColor="accent4"/>
+            </w:tcBorders>
+          </w:tcPr>
+          <w:p>
+            <w:pPr>
+              <w:rPr>
+                <w:rFonts w:ascii="Times New Roman" w:hAnsi="Times New Roman" w:cs="Times New Roman"/>
+                <w:sz w:val="20"/>
+                <w:szCs w:val="20"/>
+              </w:rPr>
+            </w:pPr>
+            <w:r>
+              <w:rPr>
+                <w:rFonts w:ascii="Times New Roman" w:hAnsi="Times New Roman" w:cs="Times New Roman"/>
+                <w:b/>
+                <w:bCs/>
+                <w:sz w:val="20"/>
+                <w:szCs w:val="20"/>
+              </w:rPr>
+              <w:t>Titular:</w:t>
+            </w:r>
+            <w:r>
+              <w:rPr>
+                <w:rFonts w:ascii="Times New Roman" w:hAnsi="Times New Roman" w:cs="Times New Roman"/>
+                <w:b/>
+                <w:bCs/>
+                <w:sz w:val="20"/>
+                <w:szCs w:val="20"/>
+              </w:rPr>
+              <w:t xml:space="preserve"> </w:t>
+            </w:r>
+            <w:r>
+              <w:rPr>
+                <w:rFonts w:ascii="Times New Roman" w:hAnsi="Times New Roman" w:cs="Times New Roman"/>
+                <w:sz w:val="20"/>
+                <w:szCs w:val="20"/>
+              </w:rPr>
+              <w:t>Accenture y su compromiso con la sostenibilidad y la descarbonización.</w:t>
+            </w:r>
+          </w:p>
+        </w:tc>
+      </w:tr>
+      <w:tr>
+        <w:tc>
+          <w:tcPr>
+            <w:tcW w:w="8494" w:type="dxa"/>
+            <w:gridSpan w:val="5"/>
+            <w:tcBorders>
+              <w:top w:val="single" w:sz="12" w:space="0" w:color="0F9ED5" w:themeColor="accent4"/>
+              <w:left w:val="single" w:sz="12" w:space="0" w:color="0F9ED5" w:themeColor="accent4"/>
+              <w:bottom w:val="single" w:sz="12" w:space="0" w:color="0F9ED5" w:themeColor="accent4"/>
+              <w:right w:val="single" w:sz="12" w:space="0" w:color="0F9ED5" w:themeColor="accent4"/>
+            </w:tcBorders>
+          </w:tcPr>
+          <w:p>
+            <w:pPr>
+              <w:rPr>
+                <w:rFonts w:ascii="Times New Roman" w:hAnsi="Times New Roman" w:cs="Times New Roman"/>
+                <w:b/>
+                <w:bCs/>
+                <w:sz w:val="20"/>
+                <w:szCs w:val="20"/>
+              </w:rPr>
+            </w:pPr>
+            <w:r>
+              <w:rPr>
+                <w:rFonts w:ascii="Times New Roman" w:hAnsi="Times New Roman" w:cs="Times New Roman"/>
+                <w:b/>
+                <w:bCs/>
+                <w:sz w:val="20"/>
+                <w:szCs w:val="20"/>
+              </w:rPr>
+              <w:t xml:space="preserve">Fecha: </w:t>
+            </w:r>
+            <w:r>
+              <w:rPr>
+                <w:rFonts w:ascii="Times New Roman" w:hAnsi="Times New Roman" w:cs="Times New Roman"/>
+                <w:sz w:val="20"/>
+                <w:szCs w:val="20"/>
+              </w:rPr>
+              <w:t>2025</w:t>
+            </w:r>
+          </w:p>
+        </w:tc>
+      </w:tr>
+      <w:tr>
+        <w:tc>
+          <w:tcPr>
+            <w:tcW w:w="8494" w:type="dxa"/>
+            <w:gridSpan w:val="5"/>
+            <w:tcBorders>
+              <w:top w:val="single" w:sz="12" w:space="0" w:color="0F9ED5" w:themeColor="accent4"/>
+              <w:left w:val="single" w:sz="12" w:space="0" w:color="0F9ED5" w:themeColor="accent4"/>
+              <w:bottom w:val="single" w:sz="12" w:space="0" w:color="0F9ED5" w:themeColor="accent4"/>
+              <w:right w:val="single" w:sz="12" w:space="0" w:color="0F9ED5" w:themeColor="accent4"/>
+            </w:tcBorders>
+          </w:tcPr>
+          <w:p>
+            <w:pPr>
+              <w:rPr>
+                <w:rFonts w:ascii="Times New Roman" w:hAnsi="Times New Roman" w:cs="Times New Roman"/>
+                <w:b/>
+                <w:bCs/>
+                <w:sz w:val="20"/>
+                <w:szCs w:val="20"/>
+                <w:lang w:val="en-GB"/>
+              </w:rPr>
+            </w:pPr>
+            <w:r>
+              <w:rPr>
+                <w:rFonts w:ascii="Times New Roman" w:hAnsi="Times New Roman" w:cs="Times New Roman"/>
+                <w:b/>
+                <w:bCs/>
+                <w:sz w:val="20"/>
+                <w:szCs w:val="20"/>
+                <w:lang w:val="en-GB"/>
+              </w:rPr>
+              <w:t xml:space="preserve">Enlace: </w:t>
+            </w:r>
+            <w:hyperlink r:id="rId12" w:history="1">
+              <w:r>
+                <w:rPr>
+                  <w:rStyle w:val="Hipervnculo"/>
+                  <w:rFonts w:ascii="Times New Roman" w:hAnsi="Times New Roman" w:cs="Times New Roman"/>
+                  <w:sz w:val="20"/>
+                  <w:szCs w:val="20"/>
+                  <w:lang w:val="en-GB"/>
+                </w:rPr>
+                <w:t>https://www.accenture.com/es-es/about/company/integrated-reporting-sustainability</w:t>
+              </w:r>
+            </w:hyperlink>
+            <w:r>
+              <w:rPr>
+                <w:rFonts w:ascii="Times New Roman" w:hAnsi="Times New Roman" w:cs="Times New Roman"/>
+                <w:sz w:val="20"/>
+                <w:szCs w:val="20"/>
+                <w:lang w:val="en-GB"/>
+              </w:rPr>
+              <w:t xml:space="preserve"> </w:t>
+            </w:r>
+          </w:p>
+        </w:tc>
+      </w:tr>
+      <w:tr>
+        <w:tc>
+          <w:tcPr>
+            <w:tcW w:w="8494" w:type="dxa"/>
+            <w:gridSpan w:val="5"/>
+            <w:tcBorders>
+              <w:top w:val="single" w:sz="12" w:space="0" w:color="0F9ED5" w:themeColor="accent4"/>
+              <w:left w:val="single" w:sz="12" w:space="0" w:color="0F9ED5" w:themeColor="accent4"/>
+              <w:bottom w:val="single" w:sz="12" w:space="0" w:color="0F9ED5" w:themeColor="accent4"/>
+              <w:right w:val="single" w:sz="12" w:space="0" w:color="0F9ED5" w:themeColor="accent4"/>
+            </w:tcBorders>
+          </w:tcPr>
+          <w:p>
+            <w:pPr>
+              <w:rPr>
+                <w:rFonts w:ascii="Times New Roman" w:hAnsi="Times New Roman" w:cs="Times New Roman"/>
+                <w:b/>
+                <w:bCs/>
+                <w:sz w:val="20"/>
+                <w:szCs w:val="20"/>
+              </w:rPr>
+            </w:pPr>
+            <w:r>
+              <w:rPr>
+                <w:rFonts w:ascii="Times New Roman" w:hAnsi="Times New Roman" w:cs="Times New Roman"/>
+                <w:b/>
+                <w:bCs/>
+                <w:sz w:val="20"/>
+                <w:szCs w:val="20"/>
+              </w:rPr>
+              <w:t>ODS relacionados:</w:t>
+            </w:r>
+            <w:r>
+              <w:rPr>
+                <w:rFonts w:ascii="Times New Roman" w:hAnsi="Times New Roman" w:cs="Times New Roman"/>
+                <w:b/>
+                <w:bCs/>
+                <w:sz w:val="20"/>
+                <w:szCs w:val="20"/>
+              </w:rPr>
+              <w:t xml:space="preserve"> </w:t>
+            </w:r>
+            <w:r>
+              <w:rPr>
+                <w:rFonts w:ascii="Times New Roman" w:hAnsi="Times New Roman" w:cs="Times New Roman"/>
+                <w:sz w:val="20"/>
+                <w:szCs w:val="20"/>
+              </w:rPr>
+              <w:t>ODS 7, ODS 9, ODS 13</w:t>
+            </w:r>
+          </w:p>
+        </w:tc>
+      </w:tr>
+      <w:tr>
+        <w:tc>
+          <w:tcPr>
+            <w:tcW w:w="1271" w:type="dxa"/>
+            <w:gridSpan w:val="2"/>
+            <w:tcBorders>
+              <w:top w:val="single" w:sz="12" w:space="0" w:color="0F9ED5" w:themeColor="accent4"/>
+              <w:left w:val="single" w:sz="12" w:space="0" w:color="0F9ED5" w:themeColor="accent4"/>
+              <w:bottom w:val="single" w:sz="12" w:space="0" w:color="0F9ED5" w:themeColor="accent4"/>
+              <w:right w:val="single" w:sz="12" w:space="0" w:color="0F9ED5" w:themeColor="accent4"/>
+            </w:tcBorders>
+          </w:tcPr>
+          <w:p>
+            <w:pPr>
+              <w:jc w:val="both"/>
+              <w:rPr>
+                <w:rFonts w:ascii="Times New Roman" w:hAnsi="Times New Roman" w:cs="Times New Roman"/>
+                <w:b/>
+                <w:bCs/>
+                <w:sz w:val="20"/>
+                <w:szCs w:val="20"/>
+              </w:rPr>
+            </w:pPr>
+          </w:p>
+          <w:p>
+            <w:pPr>
+              <w:jc w:val="both"/>
+              <w:rPr>
+                <w:rFonts w:ascii="Times New Roman" w:hAnsi="Times New Roman" w:cs="Times New Roman"/>
+                <w:b/>
+                <w:bCs/>
+                <w:sz w:val="20"/>
+                <w:szCs w:val="20"/>
+              </w:rPr>
+            </w:pPr>
+            <w:r>
+              <w:rPr>
+                <w:rFonts w:ascii="Times New Roman" w:hAnsi="Times New Roman" w:cs="Times New Roman"/>
+                <w:b/>
+                <w:bCs/>
+                <w:sz w:val="20"/>
+                <w:szCs w:val="20"/>
+              </w:rPr>
+              <w:t>Meta ODS:</w:t>
+            </w:r>
+          </w:p>
+        </w:tc>
+        <w:tc>
+          <w:tcPr>
+            <w:tcW w:w="7223" w:type="dxa"/>
+            <w:gridSpan w:val="3"/>
+            <w:tcBorders>
+              <w:top w:val="single" w:sz="12" w:space="0" w:color="0F9ED5" w:themeColor="accent4"/>
+              <w:left w:val="single" w:sz="12" w:space="0" w:color="0F9ED5" w:themeColor="accent4"/>
+              <w:bottom w:val="single" w:sz="12" w:space="0" w:color="0F9ED5" w:themeColor="accent4"/>
+              <w:right w:val="single" w:sz="12" w:space="0" w:color="0F9ED5" w:themeColor="accent4"/>
+            </w:tcBorders>
+          </w:tcPr>
+          <w:p>
+            <w:pPr>
+              <w:rPr>
+                <w:rFonts w:ascii="Times New Roman" w:hAnsi="Times New Roman" w:cs="Times New Roman"/>
+                <w:sz w:val="20"/>
+                <w:szCs w:val="20"/>
+              </w:rPr>
+            </w:pPr>
+            <w:r>
+              <w:rPr>
+                <w:rFonts w:ascii="Times New Roman" w:hAnsi="Times New Roman" w:cs="Times New Roman"/>
+                <w:sz w:val="20"/>
+                <w:szCs w:val="20"/>
+              </w:rPr>
+              <w:t>7.2: aumentar la proporción de energías renovables</w:t>
+            </w:r>
+            <w:r>
+              <w:rPr>
+                <w:rFonts w:ascii="Times New Roman" w:hAnsi="Times New Roman" w:cs="Times New Roman"/>
+                <w:sz w:val="20"/>
+                <w:szCs w:val="20"/>
+              </w:rPr>
+              <w:t>.</w:t>
+            </w:r>
+            <w:r>
+              <w:rPr>
+                <w:rFonts w:ascii="Times New Roman" w:hAnsi="Times New Roman" w:cs="Times New Roman"/>
+                <w:sz w:val="20"/>
+                <w:szCs w:val="20"/>
+              </w:rPr>
+              <w:t xml:space="preserve"> </w:t>
+            </w:r>
+          </w:p>
+          <w:p>
+            <w:pPr>
+              <w:rPr>
+                <w:rFonts w:ascii="Times New Roman" w:hAnsi="Times New Roman" w:cs="Times New Roman"/>
+                <w:sz w:val="20"/>
+                <w:szCs w:val="20"/>
+              </w:rPr>
+            </w:pPr>
+            <w:r>
+              <w:rPr>
+                <w:rFonts w:ascii="Times New Roman" w:hAnsi="Times New Roman" w:cs="Times New Roman"/>
+                <w:sz w:val="20"/>
+                <w:szCs w:val="20"/>
+              </w:rPr>
+              <w:t xml:space="preserve">9.4: modernizar infraestructuras para hacerlas sostenibles; </w:t>
+            </w:r>
+          </w:p>
+          <w:p>
+            <w:pPr>
+              <w:rPr>
+                <w:rFonts w:ascii="Times New Roman" w:hAnsi="Times New Roman" w:cs="Times New Roman"/>
+                <w:b/>
+                <w:bCs/>
+                <w:sz w:val="20"/>
+                <w:szCs w:val="20"/>
+              </w:rPr>
+            </w:pPr>
+            <w:r>
+              <w:rPr>
+                <w:rFonts w:ascii="Times New Roman" w:hAnsi="Times New Roman" w:cs="Times New Roman"/>
+                <w:sz w:val="20"/>
+                <w:szCs w:val="20"/>
+              </w:rPr>
+              <w:t>13.2: integrar medidas climáticas.</w:t>
+            </w:r>
+          </w:p>
+        </w:tc>
+      </w:tr>
+      <w:tr>
+        <w:tc>
+          <w:tcPr>
+            <w:tcW w:w="8494" w:type="dxa"/>
+            <w:gridSpan w:val="5"/>
+            <w:tcBorders>
+              <w:top w:val="single" w:sz="12" w:space="0" w:color="0F9ED5" w:themeColor="accent4"/>
+              <w:left w:val="single" w:sz="12" w:space="0" w:color="0F9ED5" w:themeColor="accent4"/>
+              <w:bottom w:val="single" w:sz="12" w:space="0" w:color="0F9ED5" w:themeColor="accent4"/>
+              <w:right w:val="single" w:sz="12" w:space="0" w:color="0F9ED5" w:themeColor="accent4"/>
+            </w:tcBorders>
+          </w:tcPr>
+          <w:p>
+            <w:pPr>
+              <w:rPr>
+                <w:rFonts w:ascii="Times New Roman" w:hAnsi="Times New Roman" w:cs="Times New Roman"/>
+                <w:b/>
+                <w:bCs/>
+                <w:sz w:val="20"/>
+                <w:szCs w:val="20"/>
+              </w:rPr>
+            </w:pPr>
+            <w:r>
+              <w:rPr>
+                <w:rFonts w:ascii="Times New Roman" w:hAnsi="Times New Roman" w:cs="Times New Roman"/>
+                <w:b/>
+                <w:bCs/>
+                <w:sz w:val="20"/>
+                <w:szCs w:val="20"/>
+              </w:rPr>
+              <w:t>Alineación jurídica:</w:t>
+            </w:r>
+            <w:r>
+              <w:rPr>
+                <w:rFonts w:ascii="Times New Roman" w:hAnsi="Times New Roman" w:cs="Times New Roman"/>
+                <w:b/>
+                <w:bCs/>
+                <w:sz w:val="20"/>
+                <w:szCs w:val="20"/>
+              </w:rPr>
+              <w:t xml:space="preserve"> </w:t>
+            </w:r>
+            <w:r>
+              <w:rPr>
+                <w:rFonts w:ascii="Times New Roman" w:hAnsi="Times New Roman" w:cs="Times New Roman"/>
+                <w:sz w:val="20"/>
+                <w:szCs w:val="20"/>
+              </w:rPr>
+              <w:t>Pacto Verde Europeo / CSRD | Relación con estrategias de transición ecológica y reducción de emisiones.</w:t>
+            </w:r>
+          </w:p>
+        </w:tc>
+      </w:tr>
+      <w:tr>
+        <w:tc>
+          <w:tcPr>
+            <w:tcW w:w="8494" w:type="dxa"/>
+            <w:gridSpan w:val="5"/>
+            <w:tcBorders>
+              <w:top w:val="single" w:sz="12" w:space="0" w:color="0F9ED5" w:themeColor="accent4"/>
+              <w:left w:val="single" w:sz="12" w:space="0" w:color="0F9ED5" w:themeColor="accent4"/>
+              <w:bottom w:val="single" w:sz="12" w:space="0" w:color="0F9ED5" w:themeColor="accent4"/>
+              <w:right w:val="single" w:sz="12" w:space="0" w:color="0F9ED5" w:themeColor="accent4"/>
+            </w:tcBorders>
+          </w:tcPr>
+          <w:p>
+            <w:pPr>
+              <w:tabs>
+                <w:tab w:val="left" w:pos="706"/>
+              </w:tabs>
+              <w:rPr>
+                <w:rFonts w:ascii="Times New Roman" w:hAnsi="Times New Roman" w:cs="Times New Roman"/>
+                <w:b/>
+                <w:bCs/>
+                <w:sz w:val="20"/>
+                <w:szCs w:val="20"/>
+              </w:rPr>
+            </w:pPr>
+            <w:r>
+              <w:rPr>
+                <w:rFonts w:ascii="Times New Roman" w:hAnsi="Times New Roman" w:cs="Times New Roman"/>
+                <w:b/>
+                <w:bCs/>
+                <w:sz w:val="20"/>
+                <w:szCs w:val="20"/>
+              </w:rPr>
+              <w:t>Indicador/KPI citado:</w:t>
+            </w:r>
+            <w:r>
+              <w:rPr>
+                <w:rFonts w:ascii="Times New Roman" w:hAnsi="Times New Roman" w:cs="Times New Roman"/>
+                <w:b/>
+                <w:bCs/>
+                <w:sz w:val="20"/>
+                <w:szCs w:val="20"/>
+              </w:rPr>
+              <w:t xml:space="preserve"> </w:t>
+            </w:r>
+            <w:r>
+              <w:rPr>
+                <w:rFonts w:ascii="Times New Roman" w:hAnsi="Times New Roman" w:cs="Times New Roman"/>
+                <w:sz w:val="20"/>
+                <w:szCs w:val="20"/>
+              </w:rPr>
+              <w:t>reducción de emisiones, consumo energético y avance en descarbonización.</w:t>
             </w:r>
           </w:p>
         </w:tc>
@@ -1183,28 +1751,373 @@
     </w:tbl>
     <w:p>
       <w:pPr>
-        <w:spacing w:line="240" w:lineRule="auto"/>
+        <w:spacing w:before="240" w:after="0" w:line="240" w:lineRule="auto"/>
         <w:jc w:val="both"/>
         <w:rPr>
           <w:rFonts w:ascii="Times New Roman" w:hAnsi="Times New Roman" w:cs="Times New Roman"/>
           <w:b/>
           <w:bCs/>
-        </w:rPr>
-      </w:pPr>
+          <w:sz w:val="20"/>
+          <w:szCs w:val="20"/>
+        </w:rPr>
+      </w:pPr>
+      <w:r>
+        <w:rPr>
+          <w:rFonts w:ascii="Times New Roman" w:hAnsi="Times New Roman" w:cs="Times New Roman"/>
+          <w:b/>
+          <w:bCs/>
+          <w:sz w:val="20"/>
+          <w:szCs w:val="20"/>
+        </w:rPr>
+        <w:t>Síntesis crítica</w:t>
+      </w:r>
     </w:p>
     <w:p>
       <w:pPr>
+        <w:spacing w:after="0" w:line="240" w:lineRule="auto"/>
         <w:jc w:val="both"/>
         <w:rPr>
           <w:rFonts w:ascii="Times New Roman" w:hAnsi="Times New Roman" w:cs="Times New Roman"/>
-          <w:u w:val="single"/>
+          <w:sz w:val="20"/>
+          <w:szCs w:val="20"/>
         </w:rPr>
       </w:pPr>
       <w:r>
         <w:rPr>
           <w:rFonts w:ascii="Times New Roman" w:hAnsi="Times New Roman" w:cs="Times New Roman"/>
+          <w:sz w:val="20"/>
+          <w:szCs w:val="20"/>
+        </w:rPr>
+        <w:t>El </w:t>
+      </w:r>
+      <w:r>
+        <w:rPr>
+          <w:rFonts w:ascii="Times New Roman" w:hAnsi="Times New Roman" w:cs="Times New Roman"/>
+          <w:b/>
+          <w:bCs/>
+          <w:sz w:val="20"/>
+          <w:szCs w:val="20"/>
+        </w:rPr>
+        <w:t>ODS 8</w:t>
+      </w:r>
+      <w:r>
+        <w:rPr>
+          <w:rFonts w:ascii="Times New Roman" w:hAnsi="Times New Roman" w:cs="Times New Roman"/>
+          <w:sz w:val="20"/>
+          <w:szCs w:val="20"/>
+        </w:rPr>
+        <w:t> es el principal porque Accenture está vinculada al empleo cualificado, la formación continua y la atracción de talento digital. La memoria de la empresa refuerza esta idea al destacar personas, innovación y desarrollo profesional.</w:t>
+      </w:r>
+    </w:p>
+    <w:p>
+      <w:pPr>
+        <w:spacing w:after="0"/>
+        <w:jc w:val="both"/>
+        <w:rPr>
+          <w:rFonts w:ascii="Times New Roman" w:hAnsi="Times New Roman" w:cs="Times New Roman"/>
+          <w:sz w:val="20"/>
+          <w:szCs w:val="20"/>
+        </w:rPr>
+      </w:pPr>
+      <w:r>
+        <w:rPr>
+          <w:rFonts w:ascii="Times New Roman" w:hAnsi="Times New Roman" w:cs="Times New Roman"/>
+          <w:b/>
+          <w:bCs/>
+          <w:sz w:val="20"/>
+          <w:szCs w:val="20"/>
+        </w:rPr>
+        <w:t>Riesgo/Controversia detectada (si la hay) y fuente:</w:t>
+      </w:r>
+      <w:r>
+        <w:rPr>
+          <w:rFonts w:ascii="Times New Roman" w:hAnsi="Times New Roman" w:cs="Times New Roman"/>
+          <w:sz w:val="20"/>
+          <w:szCs w:val="20"/>
+        </w:rPr>
+        <w:t xml:space="preserve"> Posible falta de detalle territorial sobre su impacto real en la Comunidad Valenciana. La fuente es </w:t>
+      </w:r>
+      <w:hyperlink r:id="rId13" w:history="1">
+        <w:r>
+          <w:rPr>
+            <w:rStyle w:val="Hipervnculo"/>
+            <w:rFonts w:ascii="Times New Roman" w:hAnsi="Times New Roman" w:cs="Times New Roman"/>
+            <w:sz w:val="20"/>
+            <w:szCs w:val="20"/>
+          </w:rPr>
+          <w:t>Memoria de Accenture España 2025.</w:t>
+        </w:r>
+      </w:hyperlink>
+    </w:p>
+    <w:p>
+      <w:pPr>
+        <w:spacing w:after="0"/>
+        <w:jc w:val="both"/>
+        <w:rPr>
+          <w:rFonts w:ascii="Times New Roman" w:hAnsi="Times New Roman" w:cs="Times New Roman"/>
+          <w:sz w:val="20"/>
+          <w:szCs w:val="20"/>
+        </w:rPr>
+      </w:pPr>
+      <w:r>
+        <w:rPr>
+          <w:rFonts w:ascii="Times New Roman" w:hAnsi="Times New Roman" w:cs="Times New Roman"/>
+          <w:b/>
+          <w:bCs/>
+          <w:sz w:val="20"/>
+          <w:szCs w:val="20"/>
+        </w:rPr>
+        <w:t>Mejora propuesta (acción concreta + indicador para seguimiento):</w:t>
+      </w:r>
+      <w:r>
+        <w:rPr>
+          <w:rFonts w:ascii="Times New Roman" w:hAnsi="Times New Roman" w:cs="Times New Roman"/>
+          <w:sz w:val="20"/>
+          <w:szCs w:val="20"/>
+        </w:rPr>
+        <w:t xml:space="preserve"> Incluir datos territoriales de empleo y formación. El indicador es el número de contrataciones locales y horas de formación por persona.</w:t>
+      </w:r>
+    </w:p>
+    <w:p>
+      <w:pPr>
+        <w:spacing w:after="0" w:line="240" w:lineRule="auto"/>
+        <w:jc w:val="both"/>
+        <w:rPr>
+          <w:rFonts w:ascii="Times New Roman" w:hAnsi="Times New Roman" w:cs="Times New Roman"/>
+          <w:b/>
+          <w:bCs/>
+          <w:sz w:val="20"/>
+          <w:szCs w:val="20"/>
+        </w:rPr>
+      </w:pPr>
+      <w:r>
+        <w:rPr>
+          <w:rFonts w:ascii="Times New Roman" w:hAnsi="Times New Roman" w:cs="Times New Roman"/>
+          <w:b/>
+          <w:bCs/>
+          <w:sz w:val="20"/>
+          <w:szCs w:val="20"/>
+        </w:rPr>
+        <w:t>Fuentes</w:t>
+      </w:r>
+    </w:p>
+    <w:p>
+      <w:pPr>
+        <w:spacing w:after="0" w:line="240" w:lineRule="auto"/>
+        <w:jc w:val="both"/>
+        <w:rPr>
+          <w:rFonts w:ascii="Times New Roman" w:hAnsi="Times New Roman" w:cs="Times New Roman"/>
+          <w:sz w:val="20"/>
+          <w:szCs w:val="20"/>
+        </w:rPr>
+      </w:pPr>
+      <w:r>
+        <w:rPr>
+          <w:rFonts w:ascii="Times New Roman" w:hAnsi="Times New Roman" w:cs="Times New Roman"/>
+          <w:sz w:val="20"/>
+          <w:szCs w:val="20"/>
+        </w:rPr>
+        <w:t>[</w:t>
+      </w:r>
+      <w:hyperlink r:id="rId14" w:history="1">
+        <w:r>
+          <w:rPr>
+            <w:rStyle w:val="Hipervnculo"/>
+            <w:rFonts w:ascii="Times New Roman" w:hAnsi="Times New Roman" w:cs="Times New Roman"/>
+            <w:sz w:val="20"/>
+            <w:szCs w:val="20"/>
+          </w:rPr>
+          <w:t>Enlace 1</w:t>
+        </w:r>
+      </w:hyperlink>
+      <w:r>
+        <w:rPr>
+          <w:rFonts w:ascii="Times New Roman" w:hAnsi="Times New Roman" w:cs="Times New Roman"/>
+          <w:sz w:val="20"/>
+          <w:szCs w:val="20"/>
+        </w:rPr>
+        <w:t>] – 18/09/2025.</w:t>
+      </w:r>
+    </w:p>
+    <w:p>
+      <w:pPr>
+        <w:spacing w:after="0" w:line="240" w:lineRule="auto"/>
+        <w:jc w:val="both"/>
+        <w:rPr>
+          <w:rFonts w:ascii="Times New Roman" w:hAnsi="Times New Roman" w:cs="Times New Roman"/>
+          <w:sz w:val="20"/>
+          <w:szCs w:val="20"/>
+        </w:rPr>
+      </w:pPr>
+      <w:r>
+        <w:rPr>
+          <w:rFonts w:ascii="Times New Roman" w:hAnsi="Times New Roman" w:cs="Times New Roman"/>
+          <w:sz w:val="20"/>
+          <w:szCs w:val="20"/>
+        </w:rPr>
+        <w:t>[</w:t>
+      </w:r>
+      <w:hyperlink r:id="rId15" w:history="1">
+        <w:r>
+          <w:rPr>
+            <w:rStyle w:val="Hipervnculo"/>
+            <w:rFonts w:ascii="Times New Roman" w:hAnsi="Times New Roman" w:cs="Times New Roman"/>
+            <w:sz w:val="20"/>
+            <w:szCs w:val="20"/>
+          </w:rPr>
+          <w:t xml:space="preserve">Enlace </w:t>
+        </w:r>
+        <w:r>
+          <w:rPr>
+            <w:rStyle w:val="Hipervnculo"/>
+            <w:rFonts w:ascii="Times New Roman" w:hAnsi="Times New Roman" w:cs="Times New Roman"/>
+            <w:sz w:val="20"/>
+            <w:szCs w:val="20"/>
+          </w:rPr>
+          <w:t>2</w:t>
+        </w:r>
+      </w:hyperlink>
+      <w:r>
+        <w:rPr>
+          <w:rFonts w:ascii="Times New Roman" w:hAnsi="Times New Roman" w:cs="Times New Roman"/>
+          <w:sz w:val="20"/>
+          <w:szCs w:val="20"/>
+        </w:rPr>
+        <w:t>] –</w:t>
+      </w:r>
+      <w:r>
+        <w:rPr>
+          <w:rFonts w:ascii="Times New Roman" w:hAnsi="Times New Roman" w:cs="Times New Roman"/>
+          <w:sz w:val="20"/>
+          <w:szCs w:val="20"/>
+        </w:rPr>
+        <w:t xml:space="preserve"> 18/09/2025.</w:t>
+      </w:r>
+    </w:p>
+    <w:p>
+      <w:pPr>
+        <w:spacing w:after="0" w:line="240" w:lineRule="auto"/>
+        <w:jc w:val="both"/>
+        <w:rPr>
+          <w:rFonts w:ascii="Times New Roman" w:hAnsi="Times New Roman" w:cs="Times New Roman"/>
+          <w:sz w:val="20"/>
+          <w:szCs w:val="20"/>
+        </w:rPr>
+      </w:pPr>
+      <w:r>
+        <w:rPr>
+          <w:rFonts w:ascii="Times New Roman" w:hAnsi="Times New Roman" w:cs="Times New Roman"/>
+          <w:sz w:val="20"/>
+          <w:szCs w:val="20"/>
+        </w:rPr>
+        <w:t>[</w:t>
+      </w:r>
+      <w:hyperlink r:id="rId16" w:history="1">
+        <w:r>
+          <w:rPr>
+            <w:rStyle w:val="Hipervnculo"/>
+            <w:rFonts w:ascii="Times New Roman" w:hAnsi="Times New Roman" w:cs="Times New Roman"/>
+            <w:sz w:val="20"/>
+            <w:szCs w:val="20"/>
+          </w:rPr>
+          <w:t xml:space="preserve">Enlace </w:t>
+        </w:r>
+        <w:r>
+          <w:rPr>
+            <w:rStyle w:val="Hipervnculo"/>
+            <w:rFonts w:ascii="Times New Roman" w:hAnsi="Times New Roman" w:cs="Times New Roman"/>
+            <w:sz w:val="20"/>
+            <w:szCs w:val="20"/>
+          </w:rPr>
+          <w:t>3</w:t>
+        </w:r>
+      </w:hyperlink>
+      <w:r>
+        <w:rPr>
+          <w:rFonts w:ascii="Times New Roman" w:hAnsi="Times New Roman" w:cs="Times New Roman"/>
+          <w:sz w:val="20"/>
+          <w:szCs w:val="20"/>
+        </w:rPr>
+        <w:t>] –</w:t>
+      </w:r>
+      <w:r>
+        <w:rPr>
+          <w:rFonts w:ascii="Times New Roman" w:hAnsi="Times New Roman" w:cs="Times New Roman"/>
+          <w:sz w:val="20"/>
+          <w:szCs w:val="20"/>
         </w:rPr>
         <w:t xml:space="preserve"> </w:t>
+      </w:r>
+      <w:r>
+        <w:rPr>
+          <w:rFonts w:ascii="Times New Roman" w:hAnsi="Times New Roman" w:cs="Times New Roman"/>
+          <w:sz w:val="20"/>
+          <w:szCs w:val="20"/>
+        </w:rPr>
+        <w:t>18/09/2025.</w:t>
+      </w:r>
+    </w:p>
+    <w:p>
+      <w:pPr>
+        <w:spacing w:after="0" w:line="240" w:lineRule="auto"/>
+        <w:jc w:val="both"/>
+        <w:rPr>
+          <w:rFonts w:ascii="Times New Roman" w:hAnsi="Times New Roman" w:cs="Times New Roman"/>
+          <w:sz w:val="20"/>
+          <w:szCs w:val="20"/>
+        </w:rPr>
+      </w:pPr>
+      <w:r>
+        <w:rPr>
+          <w:rFonts w:ascii="Times New Roman" w:hAnsi="Times New Roman" w:cs="Times New Roman"/>
+          <w:sz w:val="20"/>
+          <w:szCs w:val="20"/>
+        </w:rPr>
+        <w:t>[</w:t>
+      </w:r>
+      <w:hyperlink r:id="rId17" w:history="1">
+        <w:r>
+          <w:rPr>
+            <w:rStyle w:val="Hipervnculo"/>
+            <w:rFonts w:ascii="Times New Roman" w:hAnsi="Times New Roman" w:cs="Times New Roman"/>
+            <w:sz w:val="20"/>
+            <w:szCs w:val="20"/>
+          </w:rPr>
+          <w:t xml:space="preserve">Enlace </w:t>
+        </w:r>
+        <w:r>
+          <w:rPr>
+            <w:rStyle w:val="Hipervnculo"/>
+            <w:rFonts w:ascii="Times New Roman" w:hAnsi="Times New Roman" w:cs="Times New Roman"/>
+            <w:sz w:val="20"/>
+            <w:szCs w:val="20"/>
+          </w:rPr>
+          <w:t>4</w:t>
+        </w:r>
+      </w:hyperlink>
+      <w:r>
+        <w:rPr>
+          <w:rFonts w:ascii="Times New Roman" w:hAnsi="Times New Roman" w:cs="Times New Roman"/>
+          <w:sz w:val="20"/>
+          <w:szCs w:val="20"/>
+        </w:rPr>
+        <w:t>] –</w:t>
+      </w:r>
+      <w:r>
+        <w:rPr>
+          <w:rFonts w:ascii="Times New Roman" w:hAnsi="Times New Roman" w:cs="Times New Roman"/>
+          <w:sz w:val="20"/>
+          <w:szCs w:val="20"/>
+        </w:rPr>
+        <w:t xml:space="preserve"> </w:t>
+      </w:r>
+      <w:r>
+        <w:rPr>
+          <w:rFonts w:ascii="Times New Roman" w:hAnsi="Times New Roman" w:cs="Times New Roman"/>
+          <w:sz w:val="20"/>
+          <w:szCs w:val="20"/>
+        </w:rPr>
+        <w:t>18/09/2025.</w:t>
       </w:r>
     </w:p>
     <w:sectPr>
@@ -1215,6 +2128,56 @@
     </w:sectPr>
   </w:body>
 </w:document>
+</file>
+
+<file path=word/endnotes.xml><?xml version="1.0" encoding="utf-8"?>
+<w:endnotes xmlns:wpc="http://schemas.microsoft.com/office/word/2010/wordprocessingCanvas" xmlns:cx="http://schemas.microsoft.com/office/drawing/2014/chartex" xmlns:cx1="http://schemas.microsoft.com/office/drawing/2015/9/8/chartex" xmlns:cx2="http://schemas.microsoft.com/office/drawing/2015/10/21/chartex" xmlns:cx3="http://schemas.microsoft.com/office/drawing/2016/5/9/chartex" xmlns:cx4="http://schemas.microsoft.com/office/drawing/2016/5/10/chartex" xmlns:cx5="http://schemas.microsoft.com/office/drawing/2016/5/11/chartex" xmlns:cx6="http://schemas.microsoft.com/office/drawing/2016/5/12/chartex" xmlns:cx7="http://schemas.microsoft.com/office/drawing/2016/5/13/chartex" xmlns:cx8="http://schemas.microsoft.com/office/drawing/2016/5/14/chartex" xmlns:mc="http://schemas.openxmlformats.org/markup-compatibility/2006" xmlns:aink="http://schemas.microsoft.com/office/drawing/2016/ink" xmlns:am3d="http://schemas.microsoft.com/office/drawing/2017/model3d" xmlns:o="urn:schemas-microsoft-com:office:office" xmlns:oel="http://schemas.microsoft.com/office/2019/extlst" xmlns:r="http://schemas.openxmlformats.org/officeDocument/2006/relationships" xmlns:m="http://schemas.openxmlformats.org/officeDocument/2006/math" xmlns:v="urn:schemas-microsoft-com:vml" xmlns:wp14="http://schemas.microsoft.com/office/word/2010/wordprocessingDrawing" xmlns:wp="http://schemas.openxmlformats.org/drawingml/2006/wordprocessingDrawing" xmlns:w10="urn:schemas-microsoft-com:office:word" xmlns:w="http://schemas.openxmlformats.org/wordprocessingml/2006/main" xmlns:w14="http://schemas.microsoft.com/office/word/2010/wordml" xmlns:w15="http://schemas.microsoft.com/office/word/2012/wordml" xmlns:w16cex="http://schemas.microsoft.com/office/word/2018/wordml/cex" xmlns:w16cid="http://schemas.microsoft.com/office/word/2016/wordml/cid" xmlns:w16="http://schemas.microsoft.com/office/word/2018/wordml" xmlns:w16du="http://schemas.microsoft.com/office/word/2023/wordml/word16du" xmlns:w16sdtdh="http://schemas.microsoft.com/office/word/2020/wordml/sdtdatahash" xmlns:w16sdtfl="http://schemas.microsoft.com/office/word/2024/wordml/sdtformatlock" xmlns:w16se="http://schemas.microsoft.com/office/word/2015/wordml/symex" xmlns:wpg="http://schemas.microsoft.com/office/word/2010/wordprocessingGroup" xmlns:wpi="http://schemas.microsoft.com/office/word/2010/wordprocessingInk" xmlns:wne="http://schemas.microsoft.com/office/word/2006/wordml" xmlns:wps="http://schemas.microsoft.com/office/word/2010/wordprocessingShape" mc:Ignorable="w14 w15 w16se w16cid w16 w16cex w16sdtdh w16sdtfl w16du wp14">
+  <w:endnote w:type="separator" w:id="-1">
+    <w:p>
+      <w:pPr>
+        <w:spacing w:after="0" w:line="240" w:lineRule="auto"/>
+      </w:pPr>
+      <w:r>
+        <w:separator/>
+      </w:r>
+    </w:p>
+  </w:endnote>
+  <w:endnote w:type="continuationSeparator" w:id="0">
+    <w:p>
+      <w:pPr>
+        <w:spacing w:after="0" w:line="240" w:lineRule="auto"/>
+      </w:pPr>
+      <w:r>
+        <w:continuationSeparator/>
+      </w:r>
+    </w:p>
+  </w:endnote>
+</w:endnotes>
+</file>
+
+<file path=word/footnotes.xml><?xml version="1.0" encoding="utf-8"?>
+<w:footnotes xmlns:wpc="http://schemas.microsoft.com/office/word/2010/wordprocessingCanvas" xmlns:cx="http://schemas.microsoft.com/office/drawing/2014/chartex" xmlns:cx1="http://schemas.microsoft.com/office/drawing/2015/9/8/chartex" xmlns:cx2="http://schemas.microsoft.com/office/drawing/2015/10/21/chartex" xmlns:cx3="http://schemas.microsoft.com/office/drawing/2016/5/9/chartex" xmlns:cx4="http://schemas.microsoft.com/office/drawing/2016/5/10/chartex" xmlns:cx5="http://schemas.microsoft.com/office/drawing/2016/5/11/chartex" xmlns:cx6="http://schemas.microsoft.com/office/drawing/2016/5/12/chartex" xmlns:cx7="http://schemas.microsoft.com/office/drawing/2016/5/13/chartex" xmlns:cx8="http://schemas.microsoft.com/office/drawing/2016/5/14/chartex" xmlns:mc="http://schemas.openxmlformats.org/markup-compatibility/2006" xmlns:aink="http://schemas.microsoft.com/office/drawing/2016/ink" xmlns:am3d="http://schemas.microsoft.com/office/drawing/2017/model3d" xmlns:o="urn:schemas-microsoft-com:office:office" xmlns:oel="http://schemas.microsoft.com/office/2019/extlst" xmlns:r="http://schemas.openxmlformats.org/officeDocument/2006/relationships" xmlns:m="http://schemas.openxmlformats.org/officeDocument/2006/math" xmlns:v="urn:schemas-microsoft-com:vml" xmlns:wp14="http://schemas.microsoft.com/office/word/2010/wordprocessingDrawing" xmlns:wp="http://schemas.openxmlformats.org/drawingml/2006/wordprocessingDrawing" xmlns:w10="urn:schemas-microsoft-com:office:word" xmlns:w="http://schemas.openxmlformats.org/wordprocessingml/2006/main" xmlns:w14="http://schemas.microsoft.com/office/word/2010/wordml" xmlns:w15="http://schemas.microsoft.com/office/word/2012/wordml" xmlns:w16cex="http://schemas.microsoft.com/office/word/2018/wordml/cex" xmlns:w16cid="http://schemas.microsoft.com/office/word/2016/wordml/cid" xmlns:w16="http://schemas.microsoft.com/office/word/2018/wordml" xmlns:w16du="http://schemas.microsoft.com/office/word/2023/wordml/word16du" xmlns:w16sdtdh="http://schemas.microsoft.com/office/word/2020/wordml/sdtdatahash" xmlns:w16sdtfl="http://schemas.microsoft.com/office/word/2024/wordml/sdtformatlock" xmlns:w16se="http://schemas.microsoft.com/office/word/2015/wordml/symex" xmlns:wpg="http://schemas.microsoft.com/office/word/2010/wordprocessingGroup" xmlns:wpi="http://schemas.microsoft.com/office/word/2010/wordprocessingInk" xmlns:wne="http://schemas.microsoft.com/office/word/2006/wordml" xmlns:wps="http://schemas.microsoft.com/office/word/2010/wordprocessingShape" mc:Ignorable="w14 w15 w16se w16cid w16 w16cex w16sdtdh w16sdtfl w16du wp14">
+  <w:footnote w:type="separator" w:id="-1">
+    <w:p>
+      <w:pPr>
+        <w:spacing w:after="0" w:line="240" w:lineRule="auto"/>
+      </w:pPr>
+      <w:r>
+        <w:separator/>
+      </w:r>
+    </w:p>
+  </w:footnote>
+  <w:footnote w:type="continuationSeparator" w:id="0">
+    <w:p>
+      <w:pPr>
+        <w:spacing w:after="0" w:line="240" w:lineRule="auto"/>
+      </w:pPr>
+      <w:r>
+        <w:continuationSeparator/>
+      </w:r>
+    </w:p>
+  </w:footnote>
+</w:footnotes>
 </file>
 
 <file path=word/numbering.xml><?xml version="1.0" encoding="utf-8"?>
@@ -2659,6 +3622,50 @@
       <w:rFonts w:ascii="Times New Roman" w:hAnsi="Times New Roman" w:cs="Times New Roman"/>
     </w:rPr>
   </w:style>
+  <w:style w:type="paragraph" w:styleId="Encabezado">
+    <w:name w:val="header"/>
+    <w:basedOn w:val="Normal"/>
+    <w:link w:val="EncabezadoCar"/>
+    <w:uiPriority w:val="99"/>
+    <w:unhideWhenUsed/>
+    <w:rsid w:val="00495857"/>
+    <w:pPr>
+      <w:tabs>
+        <w:tab w:val="center" w:pos="4252"/>
+        <w:tab w:val="right" w:pos="8504"/>
+      </w:tabs>
+      <w:spacing w:after="0" w:line="240" w:lineRule="auto"/>
+    </w:pPr>
+  </w:style>
+  <w:style w:type="character" w:customStyle="1" w:styleId="EncabezadoCar">
+    <w:name w:val="Encabezado Car"/>
+    <w:basedOn w:val="Fuentedeprrafopredeter"/>
+    <w:link w:val="Encabezado"/>
+    <w:uiPriority w:val="99"/>
+    <w:rsid w:val="00495857"/>
+  </w:style>
+  <w:style w:type="paragraph" w:styleId="Piedepgina">
+    <w:name w:val="footer"/>
+    <w:basedOn w:val="Normal"/>
+    <w:link w:val="PiedepginaCar"/>
+    <w:uiPriority w:val="99"/>
+    <w:unhideWhenUsed/>
+    <w:rsid w:val="00495857"/>
+    <w:pPr>
+      <w:tabs>
+        <w:tab w:val="center" w:pos="4252"/>
+        <w:tab w:val="right" w:pos="8504"/>
+      </w:tabs>
+      <w:spacing w:after="0" w:line="240" w:lineRule="auto"/>
+    </w:pPr>
+  </w:style>
+  <w:style w:type="character" w:customStyle="1" w:styleId="PiedepginaCar">
+    <w:name w:val="Pie de página Car"/>
+    <w:basedOn w:val="Fuentedeprrafopredeter"/>
+    <w:link w:val="Piedepgina"/>
+    <w:uiPriority w:val="99"/>
+    <w:rsid w:val="00495857"/>
+  </w:style>
 </w:styles>
 </file>
 

</xml_diff>